<commit_message>
refactor: renomeia o executável de fluxc para flux
Atualiza Makefile, texto de ajuda, tests/run.sh, README, ERROS.md, AGENTS.md, TAREFAS.md e o artigo SBC.
</commit_message>
<xml_diff>
--- a/docs/FluxLang_Artigo_SBC.docx
+++ b/docs/FluxLang_Artigo_SBC.docx
@@ -5539,7 +5539,7 @@
           <w:sz w:val="22"/>
           <w:szCs w:val="22"/>
         </w:rPr>
-        <w:t xml:space="preserve">fluxc</w:t>
+        <w:t xml:space="preserve">flux</w:t>
       </w:r>
       <w:r>
         <w:rPr>
@@ -5618,7 +5618,7 @@
           <w:sz w:val="22"/>
           <w:szCs w:val="22"/>
         </w:rPr>
-        <w:t xml:space="preserve">fluxc</w:t>
+        <w:t xml:space="preserve">flux</w:t>
       </w:r>
       <w:r>
         <w:rPr>
@@ -5698,7 +5698,7 @@
           <w:sz w:val="22"/>
           <w:szCs w:val="22"/>
         </w:rPr>
-        <w:t xml:space="preserve">./fluxc</w:t>
+        <w:t xml:space="preserve">./flux</w:t>
       </w:r>
       <w:r>
         <w:rPr>
@@ -5729,7 +5729,7 @@
           <w:sz w:val="22"/>
           <w:szCs w:val="22"/>
         </w:rPr>
-        <w:t xml:space="preserve">./fluxc &lt; programa.flux</w:t>
+        <w:t xml:space="preserve">./flux &lt; programa.flux</w:t>
       </w:r>
       <w:r>
         <w:rPr>
@@ -5887,7 +5887,7 @@
           <w:sz w:val="22"/>
           <w:szCs w:val="22"/>
         </w:rPr>
-        <w:t xml:space="preserve">fluxc</w:t>
+        <w:t xml:space="preserve">flux</w:t>
       </w:r>
       <w:r>
         <w:rPr>
@@ -5918,7 +5918,7 @@
           <w:sz w:val="22"/>
           <w:szCs w:val="22"/>
         </w:rPr>
-        <w:t xml:space="preserve">fluxc</w:t>
+        <w:t xml:space="preserve">flux</w:t>
       </w:r>
       <w:r>
         <w:rPr>
@@ -13246,7 +13246,7 @@
           <w:sz w:val="22"/>
           <w:szCs w:val="22"/>
         </w:rPr>
-        <w:t xml:space="preserve">fluxc</w:t>
+        <w:t xml:space="preserve">flux</w:t>
       </w:r>
       <w:r>
         <w:rPr>
@@ -14422,22 +14422,6 @@
           <w:sz w:val="17"/>
           <w:szCs w:val="17"/>
         </w:rPr>
-        <w:t xml:space="preserve">// A definição de cada erro está na Tabela 6.</w:t>
-      </w:r>
-    </w:p>
-    <w:p>
-      <w:pPr>
-        <w:keepNext w:val="false"/>
-        <w:keepLines/>
-        <w:spacing w:after="0" w:before="0" w:line="240"/>
-        <w:ind w:left="284"/>
-      </w:pPr>
-      <w:r>
-        <w:rPr>
-          <w:rFonts w:ascii="Courier New" w:cs="Courier New" w:eastAsia="Courier New" w:hAnsi="Courier New"/>
-          <w:sz w:val="17"/>
-          <w:szCs w:val="17"/>
-        </w:rPr>
         <w:t xml:space="preserve"/>
       </w:r>
     </w:p>
@@ -14958,7 +14942,7 @@
           <w:sz w:val="22"/>
           <w:szCs w:val="22"/>
         </w:rPr>
-        <w:t xml:space="preserve">fluxc</w:t>
+        <w:t xml:space="preserve">flux</w:t>
       </w:r>
       <w:r>
         <w:rPr>
@@ -15139,7 +15123,7 @@
                 <w:sz w:val="19"/>
                 <w:szCs w:val="19"/>
               </w:rPr>
-              <w:t xml:space="preserve">Mensagem do fluxc</w:t>
+              <w:t xml:space="preserve">Mensagem do flux</w:t>
             </w:r>
           </w:p>
         </w:tc>
@@ -16650,7 +16634,7 @@
           <w:sz w:val="22"/>
           <w:szCs w:val="22"/>
         </w:rPr>
-        <w:t xml:space="preserve">fluxc</w:t>
+        <w:t xml:space="preserve">flux</w:t>
       </w:r>
       <w:r>
         <w:rPr>

</xml_diff>